<commit_message>
Ajusta folha timbrada à referência institucional
</commit_message>
<xml_diff>
--- a/brand/documentos/folha-timbrada-icosta.docx
+++ b/brand/documentos/folha-timbrada-icosta.docx
@@ -11,7 +11,7 @@
       <w:headerReference w:type="default" r:id="rId9"/>
       <w:footerReference w:type="default" r:id="rId10"/>
       <w:pgSz w:w="11906" w:h="16838"/>
-      <w:pgMar w:top="2438" w:right="1134" w:bottom="1304" w:left="1134" w:header="397" w:footer="454" w:gutter="0"/>
+      <w:pgMar w:top="2551" w:right="1417" w:bottom="1361" w:left="1417" w:header="454" w:footer="283" w:gutter="0"/>
       <w:cols w:space="720"/>
       <w:docGrid w:linePitch="360"/>
     </w:sectPr>
@@ -21,237 +21,157 @@
 
 <file path=word/footer1.xml><?xml version="1.0" encoding="utf-8"?>
 <w:ftr xmlns:m="http://schemas.openxmlformats.org/officeDocument/2006/math" xmlns:mc="http://schemas.openxmlformats.org/markup-compatibility/2006" xmlns:mo="http://schemas.microsoft.com/office/mac/office/2008/main" xmlns:mv="urn:schemas-microsoft-com:mac:vml" xmlns:o="urn:schemas-microsoft-com:office:office" xmlns:r="http://schemas.openxmlformats.org/officeDocument/2006/relationships" xmlns:v="urn:schemas-microsoft-com:vml" xmlns:w10="urn:schemas-microsoft-com:office:word" xmlns:w14="http://schemas.microsoft.com/office/word/2010/wordml" xmlns:w="http://schemas.openxmlformats.org/wordprocessingml/2006/main" xmlns:wne="http://schemas.microsoft.com/office/word/2006/wordml" xmlns:wp14="http://schemas.microsoft.com/office/word/2010/wordprocessingDrawing" xmlns:wp="http://schemas.openxmlformats.org/drawingml/2006/wordprocessingDrawing" xmlns:wpc="http://schemas.microsoft.com/office/word/2010/wordprocessingCanvas" xmlns:wpg="http://schemas.microsoft.com/office/word/2010/wordprocessingGroup" xmlns:wpi="http://schemas.microsoft.com/office/word/2010/wordprocessingInk" xmlns:wps="http://schemas.microsoft.com/office/word/2010/wordprocessingShape" mc:Ignorable="w14 wp14">
-  <w:tbl>
-    <w:tblPr>
-      <w:tblW w:type="auto" w:w="0"/>
+  <w:p>
+    <w:pPr>
+      <w:spacing w:after="20"/>
+      <w:ind w:left="-850" w:right="-850"/>
+      <w:jc w:val="right"/>
+    </w:pPr>
+    <w:r>
+      <w:rPr>
+        <w:rFonts w:ascii="Arial" w:hAnsi="Arial"/>
+        <w:b w:val="0"/>
+        <w:color w:val="10221C"/>
+        <w:sz w:val="13"/>
+      </w:rPr>
+      <w:t xml:space="preserve">página </w:t>
+    </w:r>
+    <w:r>
+      <w:rPr>
+        <w:rFonts w:ascii="Arial" w:hAnsi="Arial"/>
+        <w:b w:val="0"/>
+        <w:color w:val="10221C"/>
+        <w:sz w:val="13"/>
+      </w:rPr>
+      <w:fldChar w:fldCharType="begin"/>
+      <w:instrText xml:space="preserve">PAGE</w:instrText>
+      <w:fldChar w:fldCharType="separate"/>
+      <w:t>1</w:t>
+      <w:fldChar w:fldCharType="end"/>
+    </w:r>
+    <w:r>
+      <w:rPr>
+        <w:rFonts w:ascii="Arial" w:hAnsi="Arial"/>
+        <w:b w:val="0"/>
+        <w:color w:val="10221C"/>
+        <w:sz w:val="13"/>
+      </w:rPr>
+      <w:t xml:space="preserve"> de </w:t>
+    </w:r>
+    <w:r>
+      <w:rPr>
+        <w:rFonts w:ascii="Arial" w:hAnsi="Arial"/>
+        <w:b w:val="0"/>
+        <w:color w:val="10221C"/>
+        <w:sz w:val="13"/>
+      </w:rPr>
+      <w:fldChar w:fldCharType="begin"/>
+      <w:instrText xml:space="preserve">NUMPAGES</w:instrText>
+      <w:fldChar w:fldCharType="separate"/>
+      <w:t>1</w:t>
+      <w:fldChar w:fldCharType="end"/>
+    </w:r>
+  </w:p>
+  <w:p>
+    <w:pPr>
+      <w:spacing w:before="0" w:after="0"/>
+      <w:ind w:left="-850" w:right="-850"/>
       <w:jc w:val="center"/>
-      <w:tblLayout w:type="fixed"/>
-      <w:tblLook w:firstColumn="1" w:firstRow="1" w:lastColumn="0" w:lastRow="0" w:noHBand="0" w:noVBand="1" w:val="04A0"/>
-      <w:tblBorders>
-        <w:top w:val="single" w:sz="10" w:space="0" w:color="D5B66C"/>
-        <w:left w:val="nil"/>
-        <w:bottom w:val="nil"/>
-        <w:right w:val="nil"/>
-        <w:insideH w:val="nil"/>
-        <w:insideV w:val="nil"/>
-      </w:tblBorders>
-    </w:tblPr>
-    <w:tblGrid>
-      <w:gridCol w:w="8391"/>
-      <w:gridCol w:w="1247"/>
-    </w:tblGrid>
-    <w:tr>
-      <w:tc>
-        <w:tcPr>
-          <w:tcW w:type="dxa" w:w="4819"/>
-          <w:tcMar>
-            <w:top w:w="105" w:type="dxa"/>
-            <w:start w:w="0" w:type="dxa"/>
-            <w:bottom w:w="0" w:type="dxa"/>
-            <w:end w:w="120" w:type="dxa"/>
-          </w:tcMar>
-          <w:vAlign w:val="center"/>
-        </w:tcPr>
-        <w:p>
-          <w:pPr>
-            <w:spacing w:after="0" w:line="252" w:lineRule="auto"/>
-            <w:jc w:val="left"/>
-          </w:pPr>
-          <w:r>
-            <w:rPr>
-              <w:rFonts w:ascii="Arial" w:hAnsi="Arial"/>
-              <w:b w:val="0"/>
-              <w:color w:val="10221C"/>
-              <w:sz w:val="14"/>
-            </w:rPr>
-            <w:t>Avenida Alfredo Ignácio Nogueira Penido, 335, sala 104  •  Jardim Aquarius  •  São José dos Campos/SP  •  CEP 12246-000</w:t>
-          </w:r>
-          <w:r>
-            <w:rPr>
-              <w:rFonts w:ascii="Arial" w:hAnsi="Arial"/>
-              <w:b w:val="0"/>
-              <w:color w:val="10221C"/>
-              <w:sz w:val="14"/>
-            </w:rPr>
-            <w:br/>
-            <w:t>(12) 3922-9758  •  (12) 98103-9999  •  contato@icosta.adv.br</w:t>
-          </w:r>
-        </w:p>
-      </w:tc>
-      <w:tc>
-        <w:tcPr>
-          <w:tcW w:type="dxa" w:w="4819"/>
-          <w:tcMar>
-            <w:top w:w="105" w:type="dxa"/>
-            <w:start w:w="80" w:type="dxa"/>
-            <w:bottom w:w="0" w:type="dxa"/>
-            <w:end w:w="0" w:type="dxa"/>
-          </w:tcMar>
-          <w:vAlign w:val="center"/>
-        </w:tcPr>
-        <w:p>
-          <w:pPr>
-            <w:spacing w:after="0"/>
-            <w:jc w:val="right"/>
-          </w:pPr>
-          <w:r>
-            <w:rPr>
-              <w:rFonts w:ascii="Arial" w:hAnsi="Arial"/>
-              <w:b w:val="0"/>
-              <w:color w:val="10221C"/>
-              <w:sz w:val="16"/>
-            </w:rPr>
-            <w:t xml:space="preserve">Página </w:t>
-          </w:r>
-          <w:r>
-            <w:rPr>
-              <w:rFonts w:ascii="Arial" w:hAnsi="Arial"/>
-              <w:b/>
-              <w:color w:val="10221C"/>
-              <w:sz w:val="16"/>
-            </w:rPr>
-            <w:fldChar w:fldCharType="begin"/>
-            <w:instrText xml:space="preserve">PAGE</w:instrText>
-            <w:fldChar w:fldCharType="separate"/>
-            <w:t>1</w:t>
-            <w:fldChar w:fldCharType="end"/>
-          </w:r>
-        </w:p>
-      </w:tc>
-    </w:tr>
-  </w:tbl>
+      <w:pBdr>
+        <w:top w:val="single" w:sz="6" w:space="3" w:color="D5B66C"/>
+      </w:pBdr>
+    </w:pPr>
+    <w:r>
+      <w:rPr>
+        <w:rFonts w:ascii="Arial" w:hAnsi="Arial"/>
+        <w:b w:val="0"/>
+        <w:color w:val="10221C"/>
+        <w:sz w:val="13"/>
+      </w:rPr>
+      <w:t>Av. Alfredo Ignácio Nogueira Penido, 335, sala 104, Jd. Aquarius, São José dos Campos/SP, CEP 12246-000</w:t>
+    </w:r>
+    <w:r>
+      <w:rPr>
+        <w:rFonts w:ascii="Arial" w:hAnsi="Arial"/>
+        <w:b w:val="0"/>
+        <w:color w:val="D5B66C"/>
+        <w:sz w:val="13"/>
+      </w:rPr>
+      <w:t xml:space="preserve">  |  </w:t>
+    </w:r>
+    <w:r>
+      <w:rPr>
+        <w:rFonts w:ascii="Arial" w:hAnsi="Arial"/>
+        <w:b w:val="0"/>
+        <w:color w:val="10221C"/>
+        <w:sz w:val="13"/>
+      </w:rPr>
+      <w:t>(12) 3922-9758 / 98103-9999</w:t>
+    </w:r>
+    <w:r>
+      <w:rPr>
+        <w:rFonts w:ascii="Arial" w:hAnsi="Arial"/>
+        <w:b w:val="0"/>
+        <w:color w:val="D5B66C"/>
+        <w:sz w:val="13"/>
+      </w:rPr>
+      <w:t xml:space="preserve">  |  </w:t>
+    </w:r>
+    <w:r>
+      <w:rPr>
+        <w:rFonts w:ascii="Arial" w:hAnsi="Arial"/>
+        <w:b w:val="0"/>
+        <w:color w:val="10221C"/>
+        <w:sz w:val="13"/>
+      </w:rPr>
+      <w:t>contato@icosta.adv.br</w:t>
+    </w:r>
+  </w:p>
 </w:ftr>
 </file>
 
 <file path=word/header1.xml><?xml version="1.0" encoding="utf-8"?>
 <w:hdr xmlns:m="http://schemas.openxmlformats.org/officeDocument/2006/math" xmlns:mc="http://schemas.openxmlformats.org/markup-compatibility/2006" xmlns:mo="http://schemas.microsoft.com/office/mac/office/2008/main" xmlns:mv="urn:schemas-microsoft-com:mac:vml" xmlns:o="urn:schemas-microsoft-com:office:office" xmlns:r="http://schemas.openxmlformats.org/officeDocument/2006/relationships" xmlns:v="urn:schemas-microsoft-com:vml" xmlns:w10="urn:schemas-microsoft-com:office:word" xmlns:w14="http://schemas.microsoft.com/office/word/2010/wordml" xmlns:w="http://schemas.openxmlformats.org/wordprocessingml/2006/main" xmlns:wne="http://schemas.microsoft.com/office/word/2006/wordml" xmlns:wp14="http://schemas.microsoft.com/office/word/2010/wordprocessingDrawing" xmlns:wp="http://schemas.openxmlformats.org/drawingml/2006/wordprocessingDrawing" xmlns:wpc="http://schemas.microsoft.com/office/word/2010/wordprocessingCanvas" xmlns:wpg="http://schemas.microsoft.com/office/word/2010/wordprocessingGroup" xmlns:wpi="http://schemas.microsoft.com/office/word/2010/wordprocessingInk" xmlns:wps="http://schemas.microsoft.com/office/word/2010/wordprocessingShape" mc:Ignorable="w14 wp14">
-  <w:tbl>
-    <w:tblPr>
-      <w:tblW w:type="auto" w:w="0"/>
-      <w:jc w:val="center"/>
-      <w:tblLayout w:type="fixed"/>
-      <w:tblLook w:firstColumn="1" w:firstRow="1" w:lastColumn="0" w:lastRow="0" w:noHBand="0" w:noVBand="1" w:val="04A0"/>
-      <w:tblBorders>
-        <w:top w:val="nil"/>
-        <w:left w:val="nil"/>
-        <w:bottom w:val="single" w:sz="14" w:space="0" w:color="D5B66C"/>
-        <w:right w:val="nil"/>
-        <w:insideH w:val="nil"/>
-        <w:insideV w:val="nil"/>
-      </w:tblBorders>
-    </w:tblPr>
-    <w:tblGrid>
-      <w:gridCol w:w="6293"/>
-      <w:gridCol w:w="3345"/>
-    </w:tblGrid>
-    <w:tr>
-      <w:tc>
-        <w:tcPr>
-          <w:tcW w:type="dxa" w:w="4819"/>
-          <w:shd w:fill="061A15"/>
-          <w:tcMar>
-            <w:top w:w="120" w:type="dxa"/>
-            <w:start w:w="190" w:type="dxa"/>
-            <w:bottom w:w="120" w:type="dxa"/>
-            <w:end w:w="190" w:type="dxa"/>
-          </w:tcMar>
-          <w:vAlign w:val="center"/>
-        </w:tcPr>
-        <w:p>
-          <w:pPr>
-            <w:spacing w:after="0"/>
-            <w:jc w:val="left"/>
-          </w:pPr>
-          <w:r>
-            <w:drawing>
-              <wp:inline xmlns:a="http://schemas.openxmlformats.org/drawingml/2006/main" xmlns:pic="http://schemas.openxmlformats.org/drawingml/2006/picture">
-                <wp:extent cx="3384000" cy="930600"/>
-                <wp:docPr id="1" name="Logotipo ICosta" title="Logotipo ICosta" descr="ICosta Advocacia e Consultoria Jurídica"/>
-                <wp:cNvGraphicFramePr>
-                  <a:graphicFrameLocks noChangeAspect="1"/>
-                </wp:cNvGraphicFramePr>
-                <a:graphic>
-                  <a:graphicData uri="http://schemas.openxmlformats.org/drawingml/2006/picture">
-                    <pic:pic>
-                      <pic:nvPicPr>
-                        <pic:cNvPr id="0" name="logo-primary.png"/>
-                        <pic:cNvPicPr/>
-                      </pic:nvPicPr>
-                      <pic:blipFill>
-                        <a:blip r:embed="rId1"/>
-                        <a:stretch>
-                          <a:fillRect/>
-                        </a:stretch>
-                      </pic:blipFill>
-                      <pic:spPr>
-                        <a:xfrm>
-                          <a:off x="0" y="0"/>
-                          <a:ext cx="3384000" cy="930600"/>
-                        </a:xfrm>
-                        <a:prstGeom prst="rect"/>
-                      </pic:spPr>
-                    </pic:pic>
-                  </a:graphicData>
-                </a:graphic>
-              </wp:inline>
-            </w:drawing>
-          </w:r>
-        </w:p>
-      </w:tc>
-      <w:tc>
-        <w:tcPr>
-          <w:tcW w:type="dxa" w:w="4819"/>
-          <w:shd w:fill="061A15"/>
-          <w:tcMar>
-            <w:top w:w="120" w:type="dxa"/>
-            <w:start w:w="190" w:type="dxa"/>
-            <w:bottom w:w="120" w:type="dxa"/>
-            <w:end w:w="190" w:type="dxa"/>
-          </w:tcMar>
-          <w:vAlign w:val="center"/>
-        </w:tcPr>
-        <w:p>
-          <w:pPr>
-            <w:spacing w:after="0" w:line="259" w:lineRule="auto"/>
-            <w:jc w:val="right"/>
-          </w:pPr>
-          <w:r>
-            <w:rPr>
-              <w:rFonts w:ascii="Arial" w:hAnsi="Arial"/>
-              <w:b/>
-              <w:color w:val="D5B66C"/>
-              <w:sz w:val="18"/>
-            </w:rPr>
-            <w:t>icosta.adv.br</w:t>
-          </w:r>
-          <w:r>
-            <w:rPr>
-              <w:rFonts w:ascii="Arial" w:hAnsi="Arial"/>
-              <w:b w:val="0"/>
-              <w:color w:val="FFFDF7"/>
-              <w:sz w:val="16"/>
-            </w:rPr>
-            <w:br/>
-            <w:t>contato@icosta.adv.br</w:t>
-          </w:r>
-          <w:r>
-            <w:rPr>
-              <w:rFonts w:ascii="Arial" w:hAnsi="Arial"/>
-              <w:b w:val="0"/>
-              <w:color w:val="FFFDF7"/>
-              <w:sz w:val="16"/>
-            </w:rPr>
-            <w:br/>
-            <w:t>WhatsApp  (12) 98103-9999</w:t>
-          </w:r>
-        </w:p>
-      </w:tc>
-    </w:tr>
-  </w:tbl>
   <w:p>
     <w:pPr>
       <w:spacing w:after="0"/>
-    </w:pPr>
+      <w:ind w:left="-567" w:right="-567"/>
+      <w:jc w:val="left"/>
+    </w:pPr>
+    <w:r>
+      <w:drawing>
+        <wp:inline xmlns:a="http://schemas.openxmlformats.org/drawingml/2006/main" xmlns:pic="http://schemas.openxmlformats.org/drawingml/2006/picture">
+          <wp:extent cx="3672000" cy="1009800"/>
+          <wp:docPr id="1" name="Logotipo ICosta" title="Logotipo ICosta" descr="ICosta Advocacia e Consultoria Jurídica"/>
+          <wp:cNvGraphicFramePr>
+            <a:graphicFrameLocks noChangeAspect="1"/>
+          </wp:cNvGraphicFramePr>
+          <a:graphic>
+            <a:graphicData uri="http://schemas.openxmlformats.org/drawingml/2006/picture">
+              <pic:pic>
+                <pic:nvPicPr>
+                  <pic:cNvPr id="0" name="image.png"/>
+                  <pic:cNvPicPr/>
+                </pic:nvPicPr>
+                <pic:blipFill>
+                  <a:blip r:embed="rId1"/>
+                  <a:stretch>
+                    <a:fillRect/>
+                  </a:stretch>
+                </pic:blipFill>
+                <pic:spPr>
+                  <a:xfrm>
+                    <a:off x="0" y="0"/>
+                    <a:ext cx="3672000" cy="1009800"/>
+                  </a:xfrm>
+                  <a:prstGeom prst="rect"/>
+                </pic:spPr>
+              </pic:pic>
+            </a:graphicData>
+          </a:graphic>
+        </wp:inline>
+      </w:drawing>
+    </w:r>
   </w:p>
 </w:hdr>
 </file>

</xml_diff>

<commit_message>
Adiciona marca-d'água à folha timbrada
</commit_message>
<xml_diff>
--- a/brand/documentos/folha-timbrada-icosta.docx
+++ b/brand/documentos/folha-timbrada-icosta.docx
@@ -170,6 +170,49 @@
             </a:graphicData>
           </a:graphic>
         </wp:inline>
+      </w:drawing>
+    </w:r>
+    <w:r>
+      <w:drawing>
+        <wp:anchor distT="0" distB="0" distL="0" distR="0" simplePos="0" relativeHeight="0" behindDoc="1" locked="0" layoutInCell="1" allowOverlap="1">
+          <wp:simplePos x="0" y="0"/>
+          <wp:positionH relativeFrom="page">
+            <wp:posOffset>3600000</wp:posOffset>
+          </wp:positionH>
+          <wp:positionV relativeFrom="page">
+            <wp:posOffset>5220000</wp:posOffset>
+          </wp:positionV>
+          <wp:extent cx="4140000" cy="4140000"/>
+          <wp:effectExtent l="0" t="0" r="0" b="0"/>
+          <wp:wrapNone/>
+          <wp:docPr id="2" name="Marca-d'água ICosta" title="Marca-d'água ICosta" descr="Monograma institucional ICosta aplicado de forma suave ao fundo da página"/>
+          <wp:cNvGraphicFramePr xmlns:a="http://schemas.openxmlformats.org/drawingml/2006/main">
+            <a:graphicFrameLocks noChangeAspect="1"/>
+          </wp:cNvGraphicFramePr>
+          <a:graphic xmlns:a="http://schemas.openxmlformats.org/drawingml/2006/main" xmlns:pic="http://schemas.openxmlformats.org/drawingml/2006/picture">
+            <a:graphicData uri="http://schemas.openxmlformats.org/drawingml/2006/picture">
+              <pic:pic>
+                <pic:nvPicPr>
+                  <pic:cNvPr id="0" name="image.png"/>
+                  <pic:cNvPicPr/>
+                </pic:nvPicPr>
+                <pic:blipFill>
+                  <a:blip r:embed="rId2"/>
+                  <a:stretch>
+                    <a:fillRect/>
+                  </a:stretch>
+                </pic:blipFill>
+                <pic:spPr>
+                  <a:xfrm>
+                    <a:off x="0" y="0"/>
+                    <a:ext cx="4140000" cy="4140000"/>
+                  </a:xfrm>
+                  <a:prstGeom prst="rect"/>
+                </pic:spPr>
+              </pic:pic>
+            </a:graphicData>
+          </a:graphic>
+        </wp:anchor>
       </w:drawing>
     </w:r>
   </w:p>

</xml_diff>

<commit_message>
Atualiza registro OAB e telefone do escritório
</commit_message>
<xml_diff>
--- a/brand/documentos/folha-timbrada-icosta.docx
+++ b/brand/documentos/folha-timbrada-icosta.docx
@@ -23,10 +23,25 @@
 <w:ftr xmlns:m="http://schemas.openxmlformats.org/officeDocument/2006/math" xmlns:mc="http://schemas.openxmlformats.org/markup-compatibility/2006" xmlns:mo="http://schemas.microsoft.com/office/mac/office/2008/main" xmlns:mv="urn:schemas-microsoft-com:mac:vml" xmlns:o="urn:schemas-microsoft-com:office:office" xmlns:r="http://schemas.openxmlformats.org/officeDocument/2006/relationships" xmlns:v="urn:schemas-microsoft-com:vml" xmlns:w10="urn:schemas-microsoft-com:office:word" xmlns:w14="http://schemas.microsoft.com/office/word/2010/wordml" xmlns:w="http://schemas.openxmlformats.org/wordprocessingml/2006/main" xmlns:wne="http://schemas.microsoft.com/office/word/2006/wordml" xmlns:wp14="http://schemas.microsoft.com/office/word/2010/wordprocessingDrawing" xmlns:wp="http://schemas.openxmlformats.org/drawingml/2006/wordprocessingDrawing" xmlns:wpc="http://schemas.microsoft.com/office/word/2010/wordprocessingCanvas" xmlns:wpg="http://schemas.microsoft.com/office/word/2010/wordprocessingGroup" xmlns:wpi="http://schemas.microsoft.com/office/word/2010/wordprocessingInk" xmlns:wps="http://schemas.microsoft.com/office/word/2010/wordprocessingShape" mc:Ignorable="w14 wp14">
   <w:p>
     <w:pPr>
+      <w:tabs>
+        <w:tab w:pos="9921" w:val="right"/>
+      </w:tabs>
       <w:spacing w:after="20"/>
       <w:ind w:left="-850" w:right="-850"/>
-      <w:jc w:val="right"/>
-    </w:pPr>
+      <w:jc w:val="left"/>
+    </w:pPr>
+    <w:r>
+      <w:rPr>
+        <w:rFonts w:ascii="Arial" w:hAnsi="Arial"/>
+        <w:b w:val="0"/>
+        <w:color w:val="10221C"/>
+        <w:sz w:val="13"/>
+      </w:rPr>
+      <w:t>Registro da sociedade: OAB/SP nº 8.870</w:t>
+    </w:r>
+    <w:r>
+      <w:tab/>
+    </w:r>
     <w:r>
       <w:rPr>
         <w:rFonts w:ascii="Arial" w:hAnsi="Arial"/>
@@ -88,7 +103,7 @@
         <w:color w:val="10221C"/>
         <w:sz w:val="13"/>
       </w:rPr>
-      <w:t>Av. Alfredo Ignácio Nogueira Penido, 335, sala 104, Jd. Aquarius, São José dos Campos/SP, CEP 12246-000</w:t>
+      <w:t>Av. Alfredo Ignácio Nogueira Penido, 335, sala 104 · São José dos Campos/SP · CEP 12246-000</w:t>
     </w:r>
     <w:r>
       <w:rPr>
@@ -106,7 +121,7 @@
         <w:color w:val="10221C"/>
         <w:sz w:val="13"/>
       </w:rPr>
-      <w:t>(12) 3922-9758 / 98103-9999</w:t>
+      <w:t>Tel. (12) 3922-9758 · WhatsApp (12) 98103-9999</w:t>
     </w:r>
     <w:r>
       <w:rPr>

</xml_diff>